<commit_message>
Segundo entregable: alinear actividad d) al Plan de Trabajo institucional v2 (firma espectral)
Anexo 3 reescrito con el Plan de Trabajo Detallado - Actualizacion N° 01,
Version 2 (16/10/2026) como documento rector: equipo base, cronograma
12/10-18/11/2026, EDT E6.1-E6.10, hitos H6g/H7b/H7c, riesgos R04/R05,
items adaptados del indice R00 y observaciones OE-14 a OE-16. Informe
principal (antecedentes, 4.3, conclusiones y recomendaciones), Anexo 2,
Anexo 4 y PDF consolidado actualizados.

Co-Authored-By: Claude Opus 5.5 <noreply@anthropic.com>
Claude-Session: https://claude.ai/code/session_01J7Vxm47PRQCoCe3ph58u2J
</commit_message>
<xml_diff>
--- a/entregables/2do_entregable_OS4062/01_Informe_N008-2026-HSCM_Segundo_Entregable.docx
+++ b/entregables/2do_entregable_OS4062/01_Informe_N008-2026-HSCM_Segundo_Entregable.docx
@@ -1877,7 +1877,7 @@
                 <w:sz w:val="17"/>
                 <w:szCs w:val="17"/>
               </w:rPr>
-              <w:t xml:space="preserve">Anexo 3 — Informe de seguimiento del Diagnóstico del Estado de los Ecosistemas (3-A) y del Estudio de Oferta de Material Vegetal de Propagación (3-B): revisión y actualización de planes de trabajo, revisión técnica de entregables, observaciones y estado de conformidades.</w:t>
+              <w:t xml:space="preserve">Anexo 3 — Informe de seguimiento del Diagnóstico del Estado de los Ecosistemas (3-A) y del Estudio de Oferta de Material Vegetal de Propagación (3-B), desarrollados como E6 por metodología de firma espectral conforme al Plan de Trabajo institucional v2: revisión y actualización de planes de trabajo, seguimiento del cronograma, revisión técnica de entregables, observaciones y estado de conformidades.</w:t>
             </w:r>
           </w:p>
         </w:tc>
@@ -2166,7 +2166,7 @@
           <w:sz w:val="21"/>
           <w:szCs w:val="21"/>
         </w:rPr>
-        <w:t xml:space="preserve">El procedimiento para el Diagnóstico del Ecosistema y Estudio de Oferta de Material Vegetal (CP-ABR-5-2026-ANIN/DAI-1) fue declarado desierto en septiembre de 2026. La Coordinación de Proyectos IN decidió ejecutar el Entregable 6 (E6) por Administración Directa, con el equipo del proyecto y a nivel de perfil. Concurrentemente, los Comunicados Oficiales ENFEN N° 16-2026 (14 de septiembre) y N° 17-2026 (28 de septiembre) mantuvieron la Alerta de El Niño Costero con probable magnitud extraordinaria, lo que obligó a sustituir la campaña de 157 parcelas de campo prevista en la versión 1.1 del plan del E6 por una inspección remota.</w:t>
+        <w:t xml:space="preserve">El procedimiento para el Diagnóstico del Ecosistema y Estudio de Oferta de Material Vegetal (CP-ABR-5-2026-ANIN/DAI-1) fue declarado desierto en septiembre de 2026. La Coordinación de Proyectos IN decidió ejecutar el Entregable 6 (E6) por Administración Directa, con el equipo del proyecto y a nivel de perfil. Concurrentemente, los Comunicados Oficiales ENFEN N° 16-2026 (14 de septiembre) y N° 17-2026 (28 de septiembre) mantuvieron la Alerta de El Niño Costero con probable magnitud extraordinaria, lo que descartó la campaña de 157 parcelas de campo prevista en la versión 1.1 del plan del E6. El Plan de Trabajo Detallado del Perfil – Actualización N° 01, Versión 2 (16/10/2026) —en adelante, Plan de Trabajo institucional v2— descartó la reconvocatoria del proceso al haberse desarrollado con éxito la metodología de firma espectral: el E6 se elabora con el equipo base, sin servicio externo ni contratación de personal, con redacción final al 18 de noviembre de 2026.</w:t>
       </w:r>
     </w:p>
     <w:p>
@@ -3205,7 +3205,7 @@
           <w:sz w:val="15"/>
           <w:szCs w:val="15"/>
         </w:rPr>
-        <w:t xml:space="preserve">Fuente: Plan de Trabajo Detallado del Perfil (Actualización N° 02, 16/10/2026), catálogo de bloques V6 y Diagnóstico Territorial y Social, Versión 5.</w:t>
+        <w:t xml:space="preserve">Fuente: Plan de Trabajo Detallado del Perfil (Actualización N° 01, Versión 2, 16/10/2026), catálogo de bloques V6 y Diagnóstico Territorial y Social, Versión 5.</w:t>
       </w:r>
     </w:p>
     <w:p>
@@ -12638,7 +12638,7 @@
           <w:sz w:val="15"/>
           <w:szCs w:val="15"/>
         </w:rPr>
-        <w:t xml:space="preserve">Fuente: Informe de Avance – Fase de Campo (GeoSIG Ingenieros, setiembre de 2026), Cuadros 1 y 22; Plan de Trabajo Detallado del Perfil, Actualización N° 02 (16/10/2026); tablero de avance del Perfil al 03/10/2026.</w:t>
+        <w:t xml:space="preserve">Fuente: Informe de Avance – Fase de Campo (GeoSIG Ingenieros, setiembre de 2026), Cuadros 1 y 22; Plan de Trabajo Detallado del Perfil – Actualización N° 01, Versión 2 (16/10/2026); tablero de avance del Perfil al 03/10/2026.</w:t>
       </w:r>
     </w:p>
     <w:p>
@@ -14781,7 +14781,7 @@
           <w:sz w:val="21"/>
           <w:szCs w:val="21"/>
         </w:rPr>
-        <w:t xml:space="preserve">Ambos estudios de la actividad d) constituyen un solo producto del Perfil: el Entregable 6 (E6) «Diagnóstico del estado del ecosistema y estudio de oferta de material vegetal», regido por el Índice de Contenidos Mínimos 999990-ANIN001-000-XX-SC-EN-000002-R00. Declarado desierto el procedimiento de contratación y ante la alerta de El Niño Costero, el seguimiento se ejerció, en coordinación con el Especialista en Intervenciones Vegetativas de Uso Sostenible, Blgo. Abel Aucasime Orihuela, sobre la reformulación del plan de trabajo, los insumos ya producidos por órdenes de servicio y los productos del E6 por Administración Directa. El desarrollo íntegro se presenta en el Anexo 3.</w:t>
+        <w:t xml:space="preserve">Ambos estudios de la actividad d) constituyen un solo producto del Perfil: el Entregable 6 (E6) «Diagnóstico del estado del ecosistema y estudio de oferta de material vegetal», regido por el Índice de Contenidos Mínimos 999990-ANIN001-000-XX-SC-EN-000002-R00. Declarado desierto el procedimiento de contratación y ante la alerta de El Niño Costero, el E6 se desarrolla por Administración Directa con la metodología de firma espectral que adopta el Plan de Trabajo institucional v2. El seguimiento se ejerció, en coordinación con el Especialista en Intervenciones Vegetativas de Uso Sostenible, Blgo. Abel Aucasime Orihuela —consultado en la matriz RACI del E6—, sobre la secuencia de planes del E6, los insumos ya producidos por órdenes de servicio y los productos de la firma espectral. El desarrollo íntegro se presenta en el Anexo 3.</w:t>
       </w:r>
     </w:p>
     <w:p>
@@ -14804,30 +14804,7 @@
           <w:sz w:val="21"/>
           <w:szCs w:val="21"/>
         </w:rPr>
-        <w:t xml:space="preserve">El plan del E6 se actualizó de la versión 1.1 (servicio externo de 16 semanas, S/ 526,900 referenciales, 157 parcelas de campo de 0.1 ha) a la versión 2.0 «In house» (08/10/2026): 10 semanas con equipo de ANIN, inspección remota con parcelas virtuales de 0.5 ha sobre imágenes de 0.6 a 1 m, ≈ 600 puntos de validación y meta de exactitud global ≥ 85 %, e incorporación del estudio de oferta de material vegetal que la versión 1.1 no contemplaba. La revisión del suscrito («rev_hscm») ajustó la denominación de la modalidad, asignó al especialista SIG y operador RPAS, precisó el perfil del especialista en viveros, corrigió el horizonte de registro del Perfil y amplió las solicitudes de información a los inventarios florísticos de las ACR. El Plan de Trabajo Detallado del Perfil (Actualización N° 01 del 11/10/2026 y N° 02 del 16/10/2026) incorporó el cambio de modalidad y fijó la redacción final del E6 al 18/11/2026.</w:t>
-      </w:r>
-    </w:p>
-    <w:p>
-      <w:pPr>
-        <w:pStyle w:val="Heading3"/>
-        <w:keepNext/>
-      </w:pPr>
-      <w:r>
-        <w:t xml:space="preserve">4.3.2 Seguimiento de actividades y revisión técnica de entregables</w:t>
-      </w:r>
-    </w:p>
-    <w:p>
-      <w:pPr>
-        <w:spacing w:after="120" w:line="276"/>
-        <w:jc w:val="both"/>
-      </w:pPr>
-      <w:r>
-        <w:rPr>
-          <w:rFonts w:ascii="Arial" w:cs="Arial" w:eastAsia="Arial" w:hAnsi="Arial"/>
-          <w:sz w:val="21"/>
-          <w:szCs w:val="21"/>
-        </w:rPr>
-        <w:t xml:space="preserve">Sin campaña nueva de campo, el seguimiento de las actividades de campo se aplicó a la evidencia ya levantada (fichas F-DT de los 117 bloques, calicatas del E5, fichas F-DS y vuelos RPAS) y a su uso como control de la inspección remota. Se revisaron técnicamente los insumos producidos por órdenes de servicio y los productos del E6, como se resume en el Cuadro N° 10.</w:t>
+        <w:t xml:space="preserve">El plan del E6 pasó de la versión 1.1 (servicio externo de 16 semanas, S/ 526,900 referenciales, 157 parcelas de campo de 0.1 ha) a la versión 2.0 «In house» (08/10/2026: 10 semanas, parcelas virtuales sobre imágenes de 0.6 a 1 m y cierre al 18/12/2026), revisada por el suscrito («rev_hscm»). Con los resultados de la Nota Técnica N° 002-2026, el Plan de Trabajo institucional v2, elaborado por el suscrito, adoptó la metodología de firma espectral como forma de ejecución del E6 y dejó sin efecto la programación y la dotación de personal de la versión 2.0; sus comentarios sobre el E6 quedaron absueltos en el Anexo 4 de dicho plan. Los lineamientos del plan institucional para el E6 se resumen en el Cuadro N° 10.</w:t>
       </w:r>
     </w:p>
     <w:p>
@@ -14844,7 +14821,632 @@
           <w:sz w:val="19"/>
           <w:szCs w:val="19"/>
         </w:rPr>
-        <w:t xml:space="preserve">Cuadro N° 10. Revisión técnica de los productos del Diagnóstico del Estado de los Ecosistemas y del Estudio de Oferta de Material Vegetal</w:t>
+        <w:t xml:space="preserve">Cuadro N° 10. Lineamientos del Plan de Trabajo institucional v2 para el E6 (metodología de firma espectral)</w:t>
+      </w:r>
+    </w:p>
+    <w:tbl>
+      <w:tblPr>
+        <w:tblW w:type="dxa" w:w="9638"/>
+        <w:tblBorders>
+          <w:top w:val="single" w:color="auto" w:sz="4"/>
+          <w:left w:val="single" w:color="auto" w:sz="4"/>
+          <w:bottom w:val="single" w:color="auto" w:sz="4"/>
+          <w:right w:val="single" w:color="auto" w:sz="4"/>
+          <w:insideH w:val="single" w:color="auto" w:sz="4"/>
+          <w:insideV w:val="single" w:color="auto" w:sz="4"/>
+        </w:tblBorders>
+        <w:tblLayout w:type="fixed"/>
+      </w:tblPr>
+      <w:tblGrid>
+        <w:gridCol w:w="2600"/>
+        <w:gridCol w:w="7038"/>
+      </w:tblGrid>
+      <w:tr>
+        <w:trPr>
+          <w:cantSplit/>
+          <w:tblHeader/>
+        </w:trPr>
+        <w:tc>
+          <w:tcPr>
+            <w:tcW w:type="dxa" w:w="2600"/>
+            <w:tcBorders>
+              <w:top w:val="single" w:color="8C8C8C" w:sz="4"/>
+              <w:left w:val="single" w:color="8C8C8C" w:sz="4"/>
+              <w:bottom w:val="single" w:color="8C8C8C" w:sz="4"/>
+              <w:right w:val="single" w:color="8C8C8C" w:sz="4"/>
+            </w:tcBorders>
+            <w:shd w:fill="1B4D2E" w:color="auto" w:val="clear"/>
+            <w:tcMar>
+              <w:top w:type="dxa" w:w="45"/>
+              <w:left w:type="dxa" w:w="80"/>
+              <w:bottom w:type="dxa" w:w="45"/>
+              <w:right w:type="dxa" w:w="80"/>
+            </w:tcMar>
+            <w:vAlign w:val="center"/>
+          </w:tcPr>
+          <w:p>
+            <w:pPr>
+              <w:spacing w:after="0"/>
+              <w:jc w:val="center"/>
+            </w:pPr>
+            <w:r>
+              <w:rPr>
+                <w:rFonts w:ascii="Arial" w:cs="Arial" w:eastAsia="Arial" w:hAnsi="Arial"/>
+                <w:b/>
+                <w:bCs/>
+                <w:i w:val="false"/>
+                <w:iCs w:val="false"/>
+                <w:color w:val="FFFFFF"/>
+                <w:sz w:val="16"/>
+                <w:szCs w:val="16"/>
+              </w:rPr>
+              <w:t xml:space="preserve">ASPECTO</w:t>
+            </w:r>
+          </w:p>
+        </w:tc>
+        <w:tc>
+          <w:tcPr>
+            <w:tcW w:type="dxa" w:w="7038"/>
+            <w:tcBorders>
+              <w:top w:val="single" w:color="8C8C8C" w:sz="4"/>
+              <w:left w:val="single" w:color="8C8C8C" w:sz="4"/>
+              <w:bottom w:val="single" w:color="8C8C8C" w:sz="4"/>
+              <w:right w:val="single" w:color="8C8C8C" w:sz="4"/>
+            </w:tcBorders>
+            <w:shd w:fill="1B4D2E" w:color="auto" w:val="clear"/>
+            <w:tcMar>
+              <w:top w:type="dxa" w:w="45"/>
+              <w:left w:type="dxa" w:w="80"/>
+              <w:bottom w:type="dxa" w:w="45"/>
+              <w:right w:type="dxa" w:w="80"/>
+            </w:tcMar>
+            <w:vAlign w:val="center"/>
+          </w:tcPr>
+          <w:p>
+            <w:pPr>
+              <w:spacing w:after="0"/>
+              <w:jc w:val="center"/>
+            </w:pPr>
+            <w:r>
+              <w:rPr>
+                <w:rFonts w:ascii="Arial" w:cs="Arial" w:eastAsia="Arial" w:hAnsi="Arial"/>
+                <w:b/>
+                <w:bCs/>
+                <w:i w:val="false"/>
+                <w:iCs w:val="false"/>
+                <w:color w:val="FFFFFF"/>
+                <w:sz w:val="16"/>
+                <w:szCs w:val="16"/>
+              </w:rPr>
+              <w:t xml:space="preserve">DISPOSICIÓN DEL PLAN INSTITUCIONAL v2</w:t>
+            </w:r>
+          </w:p>
+        </w:tc>
+      </w:tr>
+      <w:tr>
+        <w:trPr>
+          <w:cantSplit/>
+        </w:trPr>
+        <w:tc>
+          <w:tcPr>
+            <w:tcW w:type="dxa" w:w="2600"/>
+            <w:tcBorders>
+              <w:top w:val="single" w:color="8C8C8C" w:sz="4"/>
+              <w:left w:val="single" w:color="8C8C8C" w:sz="4"/>
+              <w:bottom w:val="single" w:color="8C8C8C" w:sz="4"/>
+              <w:right w:val="single" w:color="8C8C8C" w:sz="4"/>
+            </w:tcBorders>
+            <w:tcMar>
+              <w:top w:type="dxa" w:w="45"/>
+              <w:left w:type="dxa" w:w="80"/>
+              <w:bottom w:type="dxa" w:w="45"/>
+              <w:right w:type="dxa" w:w="80"/>
+            </w:tcMar>
+            <w:vAlign w:val="center"/>
+          </w:tcPr>
+          <w:p>
+            <w:pPr>
+              <w:spacing w:after="0"/>
+              <w:jc w:val="left"/>
+            </w:pPr>
+            <w:r>
+              <w:rPr>
+                <w:rFonts w:ascii="Arial" w:cs="Arial" w:eastAsia="Arial" w:hAnsi="Arial"/>
+                <w:b w:val="false"/>
+                <w:bCs w:val="false"/>
+                <w:i w:val="false"/>
+                <w:iCs w:val="false"/>
+                <w:sz w:val="16"/>
+                <w:szCs w:val="16"/>
+              </w:rPr>
+              <w:t xml:space="preserve">Modalidad y equipo</w:t>
+            </w:r>
+          </w:p>
+        </w:tc>
+        <w:tc>
+          <w:tcPr>
+            <w:tcW w:type="dxa" w:w="7038"/>
+            <w:tcBorders>
+              <w:top w:val="single" w:color="8C8C8C" w:sz="4"/>
+              <w:left w:val="single" w:color="8C8C8C" w:sz="4"/>
+              <w:bottom w:val="single" w:color="8C8C8C" w:sz="4"/>
+              <w:right w:val="single" w:color="8C8C8C" w:sz="4"/>
+            </w:tcBorders>
+            <w:tcMar>
+              <w:top w:type="dxa" w:w="45"/>
+              <w:left w:type="dxa" w:w="80"/>
+              <w:bottom w:type="dxa" w:w="45"/>
+              <w:right w:type="dxa" w:w="80"/>
+            </w:tcMar>
+            <w:vAlign w:val="center"/>
+          </w:tcPr>
+          <w:p>
+            <w:pPr>
+              <w:spacing w:after="0"/>
+              <w:jc w:val="left"/>
+            </w:pPr>
+            <w:r>
+              <w:rPr>
+                <w:rFonts w:ascii="Arial" w:cs="Arial" w:eastAsia="Arial" w:hAnsi="Arial"/>
+                <w:b w:val="false"/>
+                <w:bCs w:val="false"/>
+                <w:i w:val="false"/>
+                <w:iCs w:val="false"/>
+                <w:sz w:val="16"/>
+                <w:szCs w:val="16"/>
+              </w:rPr>
+              <w:t xml:space="preserve">Administración Directa por el equipo base (Esp. Infraestructura Verde, responsable técnico; Especialista SIG y operador RPAS; Esp. Infraestructura Marrón, coautor); sin servicio externo ni contratación de personal (P3, P5 y P6 no requeridos)</w:t>
+            </w:r>
+          </w:p>
+        </w:tc>
+      </w:tr>
+      <w:tr>
+        <w:trPr>
+          <w:cantSplit/>
+        </w:trPr>
+        <w:tc>
+          <w:tcPr>
+            <w:tcW w:type="dxa" w:w="2600"/>
+            <w:tcBorders>
+              <w:top w:val="single" w:color="8C8C8C" w:sz="4"/>
+              <w:left w:val="single" w:color="8C8C8C" w:sz="4"/>
+              <w:bottom w:val="single" w:color="8C8C8C" w:sz="4"/>
+              <w:right w:val="single" w:color="8C8C8C" w:sz="4"/>
+            </w:tcBorders>
+            <w:shd w:fill="E8F0EA" w:color="auto" w:val="clear"/>
+            <w:tcMar>
+              <w:top w:type="dxa" w:w="45"/>
+              <w:left w:type="dxa" w:w="80"/>
+              <w:bottom w:type="dxa" w:w="45"/>
+              <w:right w:type="dxa" w:w="80"/>
+            </w:tcMar>
+            <w:vAlign w:val="center"/>
+          </w:tcPr>
+          <w:p>
+            <w:pPr>
+              <w:spacing w:after="0"/>
+              <w:jc w:val="left"/>
+            </w:pPr>
+            <w:r>
+              <w:rPr>
+                <w:rFonts w:ascii="Arial" w:cs="Arial" w:eastAsia="Arial" w:hAnsi="Arial"/>
+                <w:b w:val="false"/>
+                <w:bCs w:val="false"/>
+                <w:i w:val="false"/>
+                <w:iCs w:val="false"/>
+                <w:sz w:val="16"/>
+                <w:szCs w:val="16"/>
+              </w:rPr>
+              <w:t xml:space="preserve">Metodología</w:t>
+            </w:r>
+          </w:p>
+        </w:tc>
+        <w:tc>
+          <w:tcPr>
+            <w:tcW w:type="dxa" w:w="7038"/>
+            <w:tcBorders>
+              <w:top w:val="single" w:color="8C8C8C" w:sz="4"/>
+              <w:left w:val="single" w:color="8C8C8C" w:sz="4"/>
+              <w:bottom w:val="single" w:color="8C8C8C" w:sz="4"/>
+              <w:right w:val="single" w:color="8C8C8C" w:sz="4"/>
+            </w:tcBorders>
+            <w:shd w:fill="E8F0EA" w:color="auto" w:val="clear"/>
+            <w:tcMar>
+              <w:top w:type="dxa" w:w="45"/>
+              <w:left w:type="dxa" w:w="80"/>
+              <w:bottom w:type="dxa" w:w="45"/>
+              <w:right w:type="dxa" w:w="80"/>
+            </w:tcMar>
+            <w:vAlign w:val="center"/>
+          </w:tcPr>
+          <w:p>
+            <w:pPr>
+              <w:spacing w:after="0"/>
+              <w:jc w:val="left"/>
+            </w:pPr>
+            <w:r>
+              <w:rPr>
+                <w:rFonts w:ascii="Arial" w:cs="Arial" w:eastAsia="Arial" w:hAnsi="Arial"/>
+                <w:b w:val="false"/>
+                <w:bCs w:val="false"/>
+                <w:i w:val="false"/>
+                <w:iCs w:val="false"/>
+                <w:sz w:val="16"/>
+                <w:szCs w:val="16"/>
+              </w:rPr>
+              <w:t xml:space="preserve">Firma espectral de 92 tomas S2DR4 de 1 m (K-means, 9 clases de cobertura), MSAVI 2024 y NDVI; asignación de especies por piso altitudinal; control con la evidencia de campo 2026, sin parcelas de campo</w:t>
+            </w:r>
+          </w:p>
+        </w:tc>
+      </w:tr>
+      <w:tr>
+        <w:trPr>
+          <w:cantSplit/>
+        </w:trPr>
+        <w:tc>
+          <w:tcPr>
+            <w:tcW w:type="dxa" w:w="2600"/>
+            <w:tcBorders>
+              <w:top w:val="single" w:color="8C8C8C" w:sz="4"/>
+              <w:left w:val="single" w:color="8C8C8C" w:sz="4"/>
+              <w:bottom w:val="single" w:color="8C8C8C" w:sz="4"/>
+              <w:right w:val="single" w:color="8C8C8C" w:sz="4"/>
+            </w:tcBorders>
+            <w:tcMar>
+              <w:top w:type="dxa" w:w="45"/>
+              <w:left w:type="dxa" w:w="80"/>
+              <w:bottom w:type="dxa" w:w="45"/>
+              <w:right w:type="dxa" w:w="80"/>
+            </w:tcMar>
+            <w:vAlign w:val="center"/>
+          </w:tcPr>
+          <w:p>
+            <w:pPr>
+              <w:spacing w:after="0"/>
+              <w:jc w:val="left"/>
+            </w:pPr>
+            <w:r>
+              <w:rPr>
+                <w:rFonts w:ascii="Arial" w:cs="Arial" w:eastAsia="Arial" w:hAnsi="Arial"/>
+                <w:b w:val="false"/>
+                <w:bCs w:val="false"/>
+                <w:i w:val="false"/>
+                <w:iCs w:val="false"/>
+                <w:sz w:val="16"/>
+                <w:szCs w:val="16"/>
+              </w:rPr>
+              <w:t xml:space="preserve">Programación y avance</w:t>
+            </w:r>
+          </w:p>
+        </w:tc>
+        <w:tc>
+          <w:tcPr>
+            <w:tcW w:type="dxa" w:w="7038"/>
+            <w:tcBorders>
+              <w:top w:val="single" w:color="8C8C8C" w:sz="4"/>
+              <w:left w:val="single" w:color="8C8C8C" w:sz="4"/>
+              <w:bottom w:val="single" w:color="8C8C8C" w:sz="4"/>
+              <w:right w:val="single" w:color="8C8C8C" w:sz="4"/>
+            </w:tcBorders>
+            <w:tcMar>
+              <w:top w:type="dxa" w:w="45"/>
+              <w:left w:type="dxa" w:w="80"/>
+              <w:bottom w:type="dxa" w:w="45"/>
+              <w:right w:type="dxa" w:w="80"/>
+            </w:tcMar>
+            <w:vAlign w:val="center"/>
+          </w:tcPr>
+          <w:p>
+            <w:pPr>
+              <w:spacing w:after="0"/>
+              <w:jc w:val="left"/>
+            </w:pPr>
+            <w:r>
+              <w:rPr>
+                <w:rFonts w:ascii="Arial" w:cs="Arial" w:eastAsia="Arial" w:hAnsi="Arial"/>
+                <w:b w:val="false"/>
+                <w:bCs w:val="false"/>
+                <w:i w:val="false"/>
+                <w:iCs w:val="false"/>
+                <w:sz w:val="16"/>
+                <w:szCs w:val="16"/>
+              </w:rPr>
+              <w:t xml:space="preserve">12/10/2026 – 18/11/2026 (+79 días frente a la línea base); avance de 39 % al corte del 08/10/2026; fuera de la ruta crítica, con 35 días de holgura frente al E9</w:t>
+            </w:r>
+          </w:p>
+        </w:tc>
+      </w:tr>
+      <w:tr>
+        <w:trPr>
+          <w:cantSplit/>
+        </w:trPr>
+        <w:tc>
+          <w:tcPr>
+            <w:tcW w:type="dxa" w:w="2600"/>
+            <w:tcBorders>
+              <w:top w:val="single" w:color="8C8C8C" w:sz="4"/>
+              <w:left w:val="single" w:color="8C8C8C" w:sz="4"/>
+              <w:bottom w:val="single" w:color="8C8C8C" w:sz="4"/>
+              <w:right w:val="single" w:color="8C8C8C" w:sz="4"/>
+            </w:tcBorders>
+            <w:shd w:fill="E8F0EA" w:color="auto" w:val="clear"/>
+            <w:tcMar>
+              <w:top w:type="dxa" w:w="45"/>
+              <w:left w:type="dxa" w:w="80"/>
+              <w:bottom w:type="dxa" w:w="45"/>
+              <w:right w:type="dxa" w:w="80"/>
+            </w:tcMar>
+            <w:vAlign w:val="center"/>
+          </w:tcPr>
+          <w:p>
+            <w:pPr>
+              <w:spacing w:after="0"/>
+              <w:jc w:val="left"/>
+            </w:pPr>
+            <w:r>
+              <w:rPr>
+                <w:rFonts w:ascii="Arial" w:cs="Arial" w:eastAsia="Arial" w:hAnsi="Arial"/>
+                <w:b w:val="false"/>
+                <w:bCs w:val="false"/>
+                <w:i w:val="false"/>
+                <w:iCs w:val="false"/>
+                <w:sz w:val="16"/>
+                <w:szCs w:val="16"/>
+              </w:rPr>
+              <w:t xml:space="preserve">Hitos</w:t>
+            </w:r>
+          </w:p>
+        </w:tc>
+        <w:tc>
+          <w:tcPr>
+            <w:tcW w:type="dxa" w:w="7038"/>
+            <w:tcBorders>
+              <w:top w:val="single" w:color="8C8C8C" w:sz="4"/>
+              <w:left w:val="single" w:color="8C8C8C" w:sz="4"/>
+              <w:bottom w:val="single" w:color="8C8C8C" w:sz="4"/>
+              <w:right w:val="single" w:color="8C8C8C" w:sz="4"/>
+            </w:tcBorders>
+            <w:shd w:fill="E8F0EA" w:color="auto" w:val="clear"/>
+            <w:tcMar>
+              <w:top w:type="dxa" w:w="45"/>
+              <w:left w:type="dxa" w:w="80"/>
+              <w:bottom w:type="dxa" w:w="45"/>
+              <w:right w:type="dxa" w:w="80"/>
+            </w:tcMar>
+            <w:vAlign w:val="center"/>
+          </w:tcPr>
+          <w:p>
+            <w:pPr>
+              <w:spacing w:after="0"/>
+              <w:jc w:val="left"/>
+            </w:pPr>
+            <w:r>
+              <w:rPr>
+                <w:rFonts w:ascii="Arial" w:cs="Arial" w:eastAsia="Arial" w:hAnsi="Arial"/>
+                <w:b w:val="false"/>
+                <w:bCs w:val="false"/>
+                <w:i w:val="false"/>
+                <w:iCs w:val="false"/>
+                <w:sz w:val="16"/>
+                <w:szCs w:val="16"/>
+              </w:rPr>
+              <w:t xml:space="preserve">H6g clasificación concluida (13/10/2026, cumplido); H7b conformidad de IN/SESDI sobre la metodología (pendiente); H7c especies priorizadas y brecha de viveros al E10 (18/11/2026)</w:t>
+            </w:r>
+          </w:p>
+        </w:tc>
+      </w:tr>
+      <w:tr>
+        <w:trPr>
+          <w:cantSplit/>
+        </w:trPr>
+        <w:tc>
+          <w:tcPr>
+            <w:tcW w:type="dxa" w:w="2600"/>
+            <w:tcBorders>
+              <w:top w:val="single" w:color="8C8C8C" w:sz="4"/>
+              <w:left w:val="single" w:color="8C8C8C" w:sz="4"/>
+              <w:bottom w:val="single" w:color="8C8C8C" w:sz="4"/>
+              <w:right w:val="single" w:color="8C8C8C" w:sz="4"/>
+            </w:tcBorders>
+            <w:tcMar>
+              <w:top w:type="dxa" w:w="45"/>
+              <w:left w:type="dxa" w:w="80"/>
+              <w:bottom w:type="dxa" w:w="45"/>
+              <w:right w:type="dxa" w:w="80"/>
+            </w:tcMar>
+            <w:vAlign w:val="center"/>
+          </w:tcPr>
+          <w:p>
+            <w:pPr>
+              <w:spacing w:after="0"/>
+              <w:jc w:val="left"/>
+            </w:pPr>
+            <w:r>
+              <w:rPr>
+                <w:rFonts w:ascii="Arial" w:cs="Arial" w:eastAsia="Arial" w:hAnsi="Arial"/>
+                <w:b w:val="false"/>
+                <w:bCs w:val="false"/>
+                <w:i w:val="false"/>
+                <w:iCs w:val="false"/>
+                <w:sz w:val="16"/>
+                <w:szCs w:val="16"/>
+              </w:rPr>
+              <w:t xml:space="preserve">Alcance diferido</w:t>
+            </w:r>
+          </w:p>
+        </w:tc>
+        <w:tc>
+          <w:tcPr>
+            <w:tcW w:type="dxa" w:w="7038"/>
+            <w:tcBorders>
+              <w:top w:val="single" w:color="8C8C8C" w:sz="4"/>
+              <w:left w:val="single" w:color="8C8C8C" w:sz="4"/>
+              <w:bottom w:val="single" w:color="8C8C8C" w:sz="4"/>
+              <w:right w:val="single" w:color="8C8C8C" w:sz="4"/>
+            </w:tcBorders>
+            <w:tcMar>
+              <w:top w:type="dxa" w:w="45"/>
+              <w:left w:type="dxa" w:w="80"/>
+              <w:bottom w:type="dxa" w:w="45"/>
+              <w:right w:type="dxa" w:w="80"/>
+            </w:tcMar>
+            <w:vAlign w:val="center"/>
+          </w:tcPr>
+          <w:p>
+            <w:pPr>
+              <w:spacing w:after="0"/>
+              <w:jc w:val="left"/>
+            </w:pPr>
+            <w:r>
+              <w:rPr>
+                <w:rFonts w:ascii="Arial" w:cs="Arial" w:eastAsia="Arial" w:hAnsi="Arial"/>
+                <w:b w:val="false"/>
+                <w:bCs w:val="false"/>
+                <w:i w:val="false"/>
+                <w:iCs w:val="false"/>
+                <w:sz w:val="16"/>
+                <w:szCs w:val="16"/>
+              </w:rPr>
+              <w:t xml:space="preserve">Matriz de confusión formal, tendencia (TAU) y estructura vertical medida pasan al estudio definitivo</w:t>
+            </w:r>
+          </w:p>
+        </w:tc>
+      </w:tr>
+      <w:tr>
+        <w:trPr>
+          <w:cantSplit/>
+        </w:trPr>
+        <w:tc>
+          <w:tcPr>
+            <w:tcW w:type="dxa" w:w="2600"/>
+            <w:tcBorders>
+              <w:top w:val="single" w:color="8C8C8C" w:sz="4"/>
+              <w:left w:val="single" w:color="8C8C8C" w:sz="4"/>
+              <w:bottom w:val="single" w:color="8C8C8C" w:sz="4"/>
+              <w:right w:val="single" w:color="8C8C8C" w:sz="4"/>
+            </w:tcBorders>
+            <w:shd w:fill="E8F0EA" w:color="auto" w:val="clear"/>
+            <w:tcMar>
+              <w:top w:type="dxa" w:w="45"/>
+              <w:left w:type="dxa" w:w="80"/>
+              <w:bottom w:type="dxa" w:w="45"/>
+              <w:right w:type="dxa" w:w="80"/>
+            </w:tcMar>
+            <w:vAlign w:val="center"/>
+          </w:tcPr>
+          <w:p>
+            <w:pPr>
+              <w:spacing w:after="0"/>
+              <w:jc w:val="left"/>
+            </w:pPr>
+            <w:r>
+              <w:rPr>
+                <w:rFonts w:ascii="Arial" w:cs="Arial" w:eastAsia="Arial" w:hAnsi="Arial"/>
+                <w:b w:val="false"/>
+                <w:bCs w:val="false"/>
+                <w:i w:val="false"/>
+                <w:iCs w:val="false"/>
+                <w:sz w:val="16"/>
+                <w:szCs w:val="16"/>
+              </w:rPr>
+              <w:t xml:space="preserve">Viveros y riesgos</w:t>
+            </w:r>
+          </w:p>
+        </w:tc>
+        <w:tc>
+          <w:tcPr>
+            <w:tcW w:type="dxa" w:w="7038"/>
+            <w:tcBorders>
+              <w:top w:val="single" w:color="8C8C8C" w:sz="4"/>
+              <w:left w:val="single" w:color="8C8C8C" w:sz="4"/>
+              <w:bottom w:val="single" w:color="8C8C8C" w:sz="4"/>
+              <w:right w:val="single" w:color="8C8C8C" w:sz="4"/>
+            </w:tcBorders>
+            <w:shd w:fill="E8F0EA" w:color="auto" w:val="clear"/>
+            <w:tcMar>
+              <w:top w:type="dxa" w:w="45"/>
+              <w:left w:type="dxa" w:w="80"/>
+              <w:bottom w:type="dxa" w:w="45"/>
+              <w:right w:type="dxa" w:w="80"/>
+            </w:tcMar>
+            <w:vAlign w:val="center"/>
+          </w:tcPr>
+          <w:p>
+            <w:pPr>
+              <w:spacing w:after="0"/>
+              <w:jc w:val="left"/>
+            </w:pPr>
+            <w:r>
+              <w:rPr>
+                <w:rFonts w:ascii="Arial" w:cs="Arial" w:eastAsia="Arial" w:hAnsi="Arial"/>
+                <w:b w:val="false"/>
+                <w:bCs w:val="false"/>
+                <w:i w:val="false"/>
+                <w:iCs w:val="false"/>
+                <w:sz w:val="16"/>
+                <w:szCs w:val="16"/>
+              </w:rPr>
+              <w:t xml:space="preserve">Reasignación de funciones de la plaza de viveros entre los especialistas de Uso Sostenible, Infraestructura Verde e Infraestructura Marrón antes del 23/10/2026; riesgos R04 (conformidad de la metodología) y R05 (viveros sin responsable formal)</w:t>
+            </w:r>
+          </w:p>
+        </w:tc>
+      </w:tr>
+    </w:tbl>
+    <w:p>
+      <w:pPr>
+        <w:spacing w:after="200" w:before="50"/>
+        <w:jc w:val="both"/>
+      </w:pPr>
+      <w:r>
+        <w:rPr>
+          <w:rFonts w:ascii="Arial" w:cs="Arial" w:eastAsia="Arial" w:hAnsi="Arial"/>
+          <w:i/>
+          <w:iCs/>
+          <w:color w:val="595959"/>
+          <w:sz w:val="15"/>
+          <w:szCs w:val="15"/>
+        </w:rPr>
+        <w:t xml:space="preserve">Fuente: Plan de Trabajo institucional v2, numerales 1.1, 1.4, 7.2 y 9.3, Tablas 5, 12, 13, 16, 17 y 20; matrices del plan, hoja «E6_Firma_Espectral».</w:t>
+      </w:r>
+    </w:p>
+    <w:p>
+      <w:pPr>
+        <w:pStyle w:val="Heading3"/>
+        <w:keepNext/>
+      </w:pPr>
+      <w:r>
+        <w:t xml:space="preserve">4.3.2 Seguimiento de actividades y revisión técnica de entregables</w:t>
+      </w:r>
+    </w:p>
+    <w:p>
+      <w:pPr>
+        <w:spacing w:after="120" w:line="276"/>
+        <w:jc w:val="both"/>
+      </w:pPr>
+      <w:r>
+        <w:rPr>
+          <w:rFonts w:ascii="Arial" w:cs="Arial" w:eastAsia="Arial" w:hAnsi="Arial"/>
+          <w:sz w:val="21"/>
+          <w:szCs w:val="21"/>
+        </w:rPr>
+        <w:t xml:space="preserve">Sin campaña nueva de campo, el seguimiento se aplicó a las ocho actividades del cronograma del E6 en el plan institucional y a la evidencia ya levantada (fichas F-DT de los 117 bloques, calicatas del E5, fichas F-DS y vuelos RPAS) como control de la clasificación espectral. Se revisaron técnicamente los insumos producidos por órdenes de servicio y los productos del E6, como se resume en el Cuadro N° 11.</w:t>
+      </w:r>
+    </w:p>
+    <w:p>
+      <w:pPr>
+        <w:keepNext/>
+        <w:keepLines/>
+        <w:spacing w:after="80" w:before="160"/>
+      </w:pPr>
+      <w:r>
+        <w:rPr>
+          <w:rFonts w:ascii="Arial" w:cs="Arial" w:eastAsia="Arial" w:hAnsi="Arial"/>
+          <w:b/>
+          <w:bCs/>
+          <w:sz w:val="19"/>
+          <w:szCs w:val="19"/>
+        </w:rPr>
+        <w:t xml:space="preserve">Cuadro N° 11. Revisión técnica de los productos del Diagnóstico del Estado de los Ecosistemas y del Estudio de Oferta de Material Vegetal</w:t>
       </w:r>
     </w:p>
     <w:tbl>
@@ -15284,7 +15886,7 @@
                 <w:sz w:val="17"/>
                 <w:szCs w:val="17"/>
               </w:rPr>
-              <w:t xml:space="preserve">Adecuación de los 14 capítulos del índice a inspección remota; cinco ítems requieren conformidad expresa de SESDI</w:t>
+              <w:t xml:space="preserve">Adecuación de los 14 capítulos del índice a inspección remota</w:t>
             </w:r>
           </w:p>
         </w:tc>
@@ -15321,7 +15923,7 @@
                 <w:sz w:val="17"/>
                 <w:szCs w:val="17"/>
               </w:rPr>
-              <w:t xml:space="preserve">Revisado; conformidad de SESDI pendiente</w:t>
+              <w:t xml:space="preserve">Revisado; programación y dotación de personal sin efecto por el plan institucional v2</w:t>
             </w:r>
           </w:p>
         </w:tc>
@@ -15362,7 +15964,7 @@
                 <w:sz w:val="17"/>
                 <w:szCs w:val="17"/>
               </w:rPr>
-              <w:t xml:space="preserve">Nota Técnica N° 002-2026-ANIN/DIME/SESDI (firma espectral)</w:t>
+              <w:t xml:space="preserve">Plan de Trabajo institucional v2 (Actualización N° 01, Versión 2)</w:t>
             </w:r>
           </w:p>
         </w:tc>
@@ -15398,7 +16000,7 @@
                 <w:sz w:val="17"/>
                 <w:szCs w:val="17"/>
               </w:rPr>
-              <w:t xml:space="preserve">14/10/2026</w:t>
+              <w:t xml:space="preserve">16/10/2026</w:t>
             </w:r>
           </w:p>
         </w:tc>
@@ -15434,7 +16036,7 @@
                 <w:sz w:val="17"/>
                 <w:szCs w:val="17"/>
               </w:rPr>
-              <w:t xml:space="preserve">Clasificación de 92 tomas S2DR4 de 1 m en 9 coberturas con un único modelo</w:t>
+              <w:t xml:space="preserve">Adopta la firma espectral por el equipo base; cinco ítems adaptados del índice R00 requieren conformidad de SESDI; comentarios del suscrito absueltos (Anexo 4 del plan)</w:t>
             </w:r>
           </w:p>
         </w:tc>
@@ -15470,7 +16072,7 @@
                 <w:sz w:val="17"/>
                 <w:szCs w:val="17"/>
               </w:rPr>
-              <w:t xml:space="preserve">Remitida a la Coordinación IN; conformidad metodológica pendiente (hito H7b)</w:t>
+              <w:t xml:space="preserve">Para revisión de la Coordinación IN y conformidad de SESDI</w:t>
             </w:r>
           </w:p>
         </w:tc>
@@ -15512,6 +16114,158 @@
                 <w:sz w:val="17"/>
                 <w:szCs w:val="17"/>
               </w:rPr>
+              <w:t xml:space="preserve">Nota Técnica N° 002-2026-ANIN/DIME/SESDI (firma espectral)</w:t>
+            </w:r>
+          </w:p>
+        </w:tc>
+        <w:tc>
+          <w:tcPr>
+            <w:tcW w:type="dxa" w:w="1400"/>
+            <w:tcBorders>
+              <w:top w:val="single" w:color="8C8C8C" w:sz="4"/>
+              <w:left w:val="single" w:color="8C8C8C" w:sz="4"/>
+              <w:bottom w:val="single" w:color="8C8C8C" w:sz="4"/>
+              <w:right w:val="single" w:color="8C8C8C" w:sz="4"/>
+            </w:tcBorders>
+            <w:shd w:fill="E8F0EA" w:color="auto" w:val="clear"/>
+            <w:tcMar>
+              <w:top w:type="dxa" w:w="45"/>
+              <w:left w:type="dxa" w:w="80"/>
+              <w:bottom w:type="dxa" w:w="45"/>
+              <w:right w:type="dxa" w:w="80"/>
+            </w:tcMar>
+            <w:vAlign w:val="center"/>
+          </w:tcPr>
+          <w:p>
+            <w:pPr>
+              <w:spacing w:after="0"/>
+              <w:jc w:val="center"/>
+            </w:pPr>
+            <w:r>
+              <w:rPr>
+                <w:rFonts w:ascii="Arial" w:cs="Arial" w:eastAsia="Arial" w:hAnsi="Arial"/>
+                <w:b w:val="false"/>
+                <w:bCs w:val="false"/>
+                <w:i w:val="false"/>
+                <w:iCs w:val="false"/>
+                <w:sz w:val="17"/>
+                <w:szCs w:val="17"/>
+              </w:rPr>
+              <w:t xml:space="preserve">14/10/2026</w:t>
+            </w:r>
+          </w:p>
+        </w:tc>
+        <w:tc>
+          <w:tcPr>
+            <w:tcW w:type="dxa" w:w="3438"/>
+            <w:tcBorders>
+              <w:top w:val="single" w:color="8C8C8C" w:sz="4"/>
+              <w:left w:val="single" w:color="8C8C8C" w:sz="4"/>
+              <w:bottom w:val="single" w:color="8C8C8C" w:sz="4"/>
+              <w:right w:val="single" w:color="8C8C8C" w:sz="4"/>
+            </w:tcBorders>
+            <w:shd w:fill="E8F0EA" w:color="auto" w:val="clear"/>
+            <w:tcMar>
+              <w:top w:type="dxa" w:w="45"/>
+              <w:left w:type="dxa" w:w="80"/>
+              <w:bottom w:type="dxa" w:w="45"/>
+              <w:right w:type="dxa" w:w="80"/>
+            </w:tcMar>
+            <w:vAlign w:val="center"/>
+          </w:tcPr>
+          <w:p>
+            <w:pPr>
+              <w:spacing w:after="0"/>
+              <w:jc w:val="left"/>
+            </w:pPr>
+            <w:r>
+              <w:rPr>
+                <w:rFonts w:ascii="Arial" w:cs="Arial" w:eastAsia="Arial" w:hAnsi="Arial"/>
+                <w:b w:val="false"/>
+                <w:bCs w:val="false"/>
+                <w:i w:val="false"/>
+                <w:iCs w:val="false"/>
+                <w:sz w:val="17"/>
+                <w:szCs w:val="17"/>
+              </w:rPr>
+              <w:t xml:space="preserve">Clasificación de 92 tomas S2DR4 de 1 m en 9 coberturas con un único modelo</w:t>
+            </w:r>
+          </w:p>
+        </w:tc>
+        <w:tc>
+          <w:tcPr>
+            <w:tcW w:type="dxa" w:w="2200"/>
+            <w:tcBorders>
+              <w:top w:val="single" w:color="8C8C8C" w:sz="4"/>
+              <w:left w:val="single" w:color="8C8C8C" w:sz="4"/>
+              <w:bottom w:val="single" w:color="8C8C8C" w:sz="4"/>
+              <w:right w:val="single" w:color="8C8C8C" w:sz="4"/>
+            </w:tcBorders>
+            <w:shd w:fill="E8F0EA" w:color="auto" w:val="clear"/>
+            <w:tcMar>
+              <w:top w:type="dxa" w:w="45"/>
+              <w:left w:type="dxa" w:w="80"/>
+              <w:bottom w:type="dxa" w:w="45"/>
+              <w:right w:type="dxa" w:w="80"/>
+            </w:tcMar>
+            <w:vAlign w:val="center"/>
+          </w:tcPr>
+          <w:p>
+            <w:pPr>
+              <w:spacing w:after="0"/>
+              <w:jc w:val="left"/>
+            </w:pPr>
+            <w:r>
+              <w:rPr>
+                <w:rFonts w:ascii="Arial" w:cs="Arial" w:eastAsia="Arial" w:hAnsi="Arial"/>
+                <w:b w:val="false"/>
+                <w:bCs w:val="false"/>
+                <w:i w:val="false"/>
+                <w:iCs w:val="false"/>
+                <w:sz w:val="17"/>
+                <w:szCs w:val="17"/>
+              </w:rPr>
+              <w:t xml:space="preserve">Remitida a la Coordinación IN; conformidad de IN/SESDI sobre la metodología pendiente (hito H7b)</w:t>
+            </w:r>
+          </w:p>
+        </w:tc>
+      </w:tr>
+      <w:tr>
+        <w:trPr>
+          <w:cantSplit/>
+        </w:trPr>
+        <w:tc>
+          <w:tcPr>
+            <w:tcW w:type="dxa" w:w="2600"/>
+            <w:tcBorders>
+              <w:top w:val="single" w:color="8C8C8C" w:sz="4"/>
+              <w:left w:val="single" w:color="8C8C8C" w:sz="4"/>
+              <w:bottom w:val="single" w:color="8C8C8C" w:sz="4"/>
+              <w:right w:val="single" w:color="8C8C8C" w:sz="4"/>
+            </w:tcBorders>
+            <w:tcMar>
+              <w:top w:type="dxa" w:w="45"/>
+              <w:left w:type="dxa" w:w="80"/>
+              <w:bottom w:type="dxa" w:w="45"/>
+              <w:right w:type="dxa" w:w="80"/>
+            </w:tcMar>
+            <w:vAlign w:val="center"/>
+          </w:tcPr>
+          <w:p>
+            <w:pPr>
+              <w:spacing w:after="0"/>
+              <w:jc w:val="left"/>
+            </w:pPr>
+            <w:r>
+              <w:rPr>
+                <w:rFonts w:ascii="Arial" w:cs="Arial" w:eastAsia="Arial" w:hAnsi="Arial"/>
+                <w:b w:val="false"/>
+                <w:bCs w:val="false"/>
+                <w:i w:val="false"/>
+                <w:iCs w:val="false"/>
+                <w:sz w:val="17"/>
+                <w:szCs w:val="17"/>
+              </w:rPr>
               <w:t xml:space="preserve">Informe E6 y matrices (versión para revisión de SESDI)</w:t>
             </w:r>
           </w:p>
@@ -15525,7 +16279,6 @@
               <w:bottom w:val="single" w:color="8C8C8C" w:sz="4"/>
               <w:right w:val="single" w:color="8C8C8C" w:sz="4"/>
             </w:tcBorders>
-            <w:shd w:fill="E8F0EA" w:color="auto" w:val="clear"/>
             <w:tcMar>
               <w:top w:type="dxa" w:w="45"/>
               <w:left w:type="dxa" w:w="80"/>
@@ -15562,7 +16315,6 @@
               <w:bottom w:val="single" w:color="8C8C8C" w:sz="4"/>
               <w:right w:val="single" w:color="8C8C8C" w:sz="4"/>
             </w:tcBorders>
-            <w:shd w:fill="E8F0EA" w:color="auto" w:val="clear"/>
             <w:tcMar>
               <w:top w:type="dxa" w:w="45"/>
               <w:left w:type="dxa" w:w="80"/>
@@ -15599,31 +16351,30 @@
               <w:bottom w:val="single" w:color="8C8C8C" w:sz="4"/>
               <w:right w:val="single" w:color="8C8C8C" w:sz="4"/>
             </w:tcBorders>
-            <w:shd w:fill="E8F0EA" w:color="auto" w:val="clear"/>
-            <w:tcMar>
-              <w:top w:type="dxa" w:w="45"/>
-              <w:left w:type="dxa" w:w="80"/>
-              <w:bottom w:type="dxa" w:w="45"/>
-              <w:right w:type="dxa" w:w="80"/>
-            </w:tcMar>
-            <w:vAlign w:val="center"/>
-          </w:tcPr>
-          <w:p>
-            <w:pPr>
-              <w:spacing w:after="0"/>
-              <w:jc w:val="left"/>
-            </w:pPr>
-            <w:r>
-              <w:rPr>
-                <w:rFonts w:ascii="Arial" w:cs="Arial" w:eastAsia="Arial" w:hAnsi="Arial"/>
-                <w:b w:val="false"/>
-                <w:bCs w:val="false"/>
-                <w:i w:val="false"/>
-                <w:iCs w:val="false"/>
-                <w:sz w:val="17"/>
-                <w:szCs w:val="17"/>
-              </w:rPr>
-              <w:t xml:space="preserve">En revisión; observaciones de consistencia formuladas (Anexo 3)</w:t>
+            <w:tcMar>
+              <w:top w:type="dxa" w:w="45"/>
+              <w:left w:type="dxa" w:w="80"/>
+              <w:bottom w:type="dxa" w:w="45"/>
+              <w:right w:type="dxa" w:w="80"/>
+            </w:tcMar>
+            <w:vAlign w:val="center"/>
+          </w:tcPr>
+          <w:p>
+            <w:pPr>
+              <w:spacing w:after="0"/>
+              <w:jc w:val="left"/>
+            </w:pPr>
+            <w:r>
+              <w:rPr>
+                <w:rFonts w:ascii="Arial" w:cs="Arial" w:eastAsia="Arial" w:hAnsi="Arial"/>
+                <w:b w:val="false"/>
+                <w:bCs w:val="false"/>
+                <w:i w:val="false"/>
+                <w:iCs w:val="false"/>
+                <w:sz w:val="17"/>
+                <w:szCs w:val="17"/>
+              </w:rPr>
+              <w:t xml:space="preserve">En revisión; observaciones de consistencia y de alineación al plan institucional (Anexo 3)</w:t>
             </w:r>
           </w:p>
         </w:tc>
@@ -15643,7 +16394,7 @@
           <w:sz w:val="15"/>
           <w:szCs w:val="15"/>
         </w:rPr>
-        <w:t xml:space="preserve">Fuente: tablero de avance del Perfil al 03/10/2026; E6 v2.0 y su revisión; Nota Técnica N° 002-2026; Informe E6 (octubre de 2026).</w:t>
+        <w:t xml:space="preserve">Fuente: tablero de avance del Perfil al 03/10/2026; E6 v2.0 y su revisión; Plan de Trabajo institucional v2; Nota Técnica N° 002-2026; Informe E6 (octubre de 2026).</w:t>
       </w:r>
     </w:p>
     <w:p>
@@ -15666,7 +16417,7 @@
           <w:sz w:val="21"/>
           <w:szCs w:val="21"/>
         </w:rPr>
-        <w:t xml:space="preserve">El E6 diagnosticó los 117 bloques (12,270.235 ha) con la firma espectral de 92 tomas S2DR4 de 1 m, el MSAVI 2024 y el NDVI, contrastados con la evidencia de campo 2026. Sus resultados principales se presentan en el Cuadro N° 11.</w:t>
+        <w:t xml:space="preserve">El E6 diagnosticó los 117 bloques (12,270.235 ha) con la firma espectral de 92 tomas S2DR4 de 1 m, el MSAVI 2024 y el NDVI, contrastados con la evidencia de campo 2026. Sus resultados, que el plan institucional recoge en su numeral 7.2, se presentan en el Cuadro N° 12.</w:t>
       </w:r>
     </w:p>
     <w:p>
@@ -15683,7 +16434,7 @@
           <w:sz w:val="19"/>
           <w:szCs w:val="19"/>
         </w:rPr>
-        <w:t xml:space="preserve">Cuadro N° 11. Resultados principales del Entregable 6 en el ámbito del proyecto</w:t>
+        <w:t xml:space="preserve">Cuadro N° 12. Resultados principales del Entregable 6 en el ámbito del proyecto</w:t>
       </w:r>
     </w:p>
     <w:tbl>
@@ -16133,7 +16884,7 @@
                 <w:sz w:val="17"/>
                 <w:szCs w:val="17"/>
               </w:rPr>
-              <w:t xml:space="preserve">Inspección remota</w:t>
+              <w:t xml:space="preserve">Clasificación espectral</w:t>
             </w:r>
           </w:p>
         </w:tc>
@@ -16169,7 +16920,7 @@
                 <w:sz w:val="17"/>
                 <w:szCs w:val="17"/>
               </w:rPr>
-              <w:t xml:space="preserve">1,374 parcelas virtuales en bloques y 102 de referencia; todos los estratos cumplen el error de 15 % salvo el matorral andino bajo umbral</w:t>
+              <w:t xml:space="preserve">92 tomas S2DR4 de 1 m clasificadas en 9 coberturas (13/10/2026); lectura de control en 1,374 parcelas virtuales y 102 de referencia, con error ≤ 15 % salvo el matorral andino bajo umbral</w:t>
             </w:r>
           </w:p>
         </w:tc>
@@ -16438,7 +17189,7 @@
           <w:sz w:val="21"/>
           <w:szCs w:val="21"/>
         </w:rPr>
-        <w:t xml:space="preserve">En cuanto a conformidades, el E6 se encuentra en versión para revisión de SESDI: la conformidad de la adecuación metodológica (memorando de SESDI e hito H7b) y la del informe final están pendientes. El componente de oferta de material vegetal es el de menor avance —censo remoto de viveros y cálculo de la brecha con los parámetros del E10 pendientes— y la plaza de Especialista en Infraestructura Rural para la Producción (viveros) quedó desierta, por lo que sus funciones deben reasignarse formalmente entre los especialistas de Intervenciones Vegetativas de Uso Sostenible, Infraestructura Verde e Infraestructura Marrón.</w:t>
+        <w:t xml:space="preserve">En cuanto a conformidades, el E6 se encuentra en versión para revisión de SESDI, con redacción final al 18/11/2026: la conformidad de IN/SESDI sobre la metodología de firma espectral (hito H7b, sin número de documento al corte) y la del informe final están pendientes. Se formularon 16 observaciones al diagnóstico y 8 a la oferta; cuatro de ellas alinean el Informe E6 y las matrices con el plan institucional (referencia metodológica, avance del E6, nota del equipo y unidad de análisis). El componente de oferta de material vegetal es el de menor avance —censo remoto de viveros y cálculo de la brecha con los parámetros del E10 pendientes— y la plaza de Especialista en Infraestructura Rural para la Producción (viveros) quedó desierta, por lo que sus funciones deben reasignarse formalmente entre los especialistas de Intervenciones Vegetativas de Uso Sostenible, Infraestructura Verde e Infraestructura Marrón.</w:t>
       </w:r>
     </w:p>
     <w:p>
@@ -16601,7 +17352,7 @@
           <w:sz w:val="21"/>
           <w:szCs w:val="21"/>
         </w:rPr>
-        <w:t xml:space="preserve">Persisten dos criterios de cálculo de la brecha (media del bloque y distribución areal del E6), por lo que el indicador de la R.M. N° 00213-2024-MINAM no es aún sumable entre provincias.</w:t>
+        <w:t xml:space="preserve">Persisten criterios distintos de cálculo de la brecha —media del bloque de los volúmenes, distribución areal del E6 y media del MSAVI por ecosistema que propone el Plan de Trabajo institucional v2—, por lo que el indicador de la R.M. N° 00213-2024-MINAM no es aún sumable entre provincias.</w:t>
       </w:r>
     </w:p>
     <w:p>
@@ -16789,7 +17540,7 @@
           <w:sz w:val="21"/>
           <w:szCs w:val="21"/>
         </w:rPr>
-        <w:t xml:space="preserve">El Diagnóstico del Estado de los Ecosistemas y el Estudio de Oferta de Material Vegetal se ejecutan como E6 por Administración Directa; su plan de trabajo fue revisado y actualizado a la versión 2.0 «In house» y el Plan de Trabajo Detallado del Perfil fija su redacción final al 18/11/2026.</w:t>
+        <w:t xml:space="preserve">El Diagnóstico del Estado de los Ecosistemas y el Estudio de Oferta de Material Vegetal se ejecutan como E6 por Administración Directa con la metodología de firma espectral, conforme al Plan de Trabajo institucional v2 (16/10/2026): equipo base, sin servicio externo ni contratación de personal, periodo 12/10–18/11/2026 y fuera de la ruta crítica. El plan del E6 se revisó y actualizó de la versión 1.1 a la 2.0 «In house» y, finalmente, al plan institucional, que deja sin efecto la programación de 10 semanas de la versión 2.0.</w:t>
       </w:r>
     </w:p>
     <w:p>
@@ -16813,7 +17564,7 @@
           <w:sz w:val="21"/>
           <w:szCs w:val="21"/>
         </w:rPr>
-        <w:t xml:space="preserve">Se revisaron técnicamente los insumos de las OS 1147, 1148, 2357, 2726 y 2797, la Nota Técnica N° 002-2026 y el Informe E6 en versión para revisión de SESDI; las observaciones formuladas se registran en el Anexo 3.</w:t>
+        <w:t xml:space="preserve">Se dio seguimiento a las ocho actividades del cronograma del E6 —la clasificación de 92 tomas S2DR4 concluyó el 13/10/2026 (hito H6g)— y se revisaron técnicamente los insumos de las OS 1147, 1148, 2357, 2726 y 2797, la Nota Técnica N° 002-2026 y el Informe E6 en versión para revisión de SESDI; se formularon 16 observaciones al diagnóstico y 8 a la oferta (Anexo 3).</w:t>
       </w:r>
     </w:p>
     <w:p>
@@ -16837,7 +17588,7 @@
           <w:sz w:val="21"/>
           <w:szCs w:val="21"/>
         </w:rPr>
-        <w:t xml:space="preserve">El E6 cuantifica 8,341.82 ha (68.0 %) bajo el umbral MSAVI en los 117 bloques, con 5,503.41 ha para restauración activa; la oferta de material vegetal identificada (21,000 plantones) es mínima frente a la escala de la intervención, y la conformidad de SESDI del E6 está pendiente.</w:t>
+        <w:t xml:space="preserve">El E6 cuantifica 8,341.82 ha (68.0 %) bajo el umbral MSAVI en los 117 bloques, con 5,503.41 ha para restauración activa; la oferta de material vegetal identificada (21,000 plantones) es mínima frente a la escala de la intervención, y la conformidad de IN/SESDI sobre la metodología de firma espectral (hito H7b) está pendiente.</w:t>
       </w:r>
     </w:p>
     <w:p>
@@ -16902,7 +17653,7 @@
           <w:sz w:val="21"/>
           <w:szCs w:val="21"/>
         </w:rPr>
-        <w:t xml:space="preserve">Adoptar un criterio único de brecha para los 117 bloques —preferentemente la distribución areal del E6 bajo el umbral MSAVI 0.4976— y recalcular con él el indicador consolidado del Perfil.</w:t>
+        <w:t xml:space="preserve">Adoptar un criterio único de brecha para los 117 bloques con la aprobación del Plan de Trabajo institucional v2 —media del MSAVI por ecosistema frente al umbral 0.4976, con umbral por ecosistema definido por consenso del equipo de especialistas— y recalcular con él el indicador consolidado del Perfil.</w:t>
       </w:r>
     </w:p>
     <w:p>
@@ -17102,7 +17853,7 @@
           <w:sz w:val="21"/>
           <w:szCs w:val="21"/>
         </w:rPr>
-        <w:t xml:space="preserve">Emitir el memorando de SESDI que acepte la adecuación metodológica del E6 (inspección remota) y los ítems adaptados del índice de contenidos mínimos.</w:t>
+        <w:t xml:space="preserve">Emitir la conformidad de IN/SESDI sobre la metodología de firma espectral del E6 y los cinco ítems adaptados del índice R00 (hito H7b), sobre la base de la Nota Técnica N° 002-2026.</w:t>
       </w:r>
     </w:p>
     <w:p>
@@ -17126,7 +17877,7 @@
           <w:sz w:val="21"/>
           <w:szCs w:val="21"/>
         </w:rPr>
-        <w:t xml:space="preserve">Ejecutar la validación ciega de 567 puntos, densificar el estrato de matorral andino bajo umbral y completar la consulta Delphi de atributos de especies antes de la conformidad del E6.</w:t>
+        <w:t xml:space="preserve">Alinear el informe final del E6 al plan institucional —referencia metodológica, nota del equipo, píxel de 1 m como unidad de análisis y vacíos trasladados al estudio definitivo (matriz de confusión, TAU y estructura vertical)— y homologar el avance del E6 entre el plan y sus matrices.</w:t>
       </w:r>
     </w:p>
     <w:p>
@@ -17150,7 +17901,7 @@
           <w:sz w:val="21"/>
           <w:szCs w:val="21"/>
         </w:rPr>
-        <w:t xml:space="preserve">Reasignar formalmente las funciones de la plaza de viveros y ejecutar el censo remoto de viveros y fuentes semilleras, para entregar al E10 la oferta efectiva y la brecha de plantones por escenarios.</w:t>
+        <w:t xml:space="preserve">Formalizar la reasignación de las funciones de la plaza de viveros y ejecutar con el equipo base el censo remoto de viveros y fuentes semilleras, para entregar al E10 las especies priorizadas y la brecha de viveros por escenarios el 18/11/2026 (hito H7c).</w:t>
       </w:r>
     </w:p>
     <w:p>
@@ -17174,7 +17925,7 @@
           <w:sz w:val="21"/>
           <w:szCs w:val="21"/>
         </w:rPr>
-        <w:t xml:space="preserve">Homologar las fechas del E6 entre su plan v2.0 (18/12/2026) y el Plan de Trabajo Detallado (18/11/2026), y la referencia al catálogo V6 en la Nota Técnica N° 002-2026.</w:t>
+        <w:t xml:space="preserve">Corregir en la Nota Técnica N° 002-2026 la referencia al catálogo V6, densificar la lectura del estrato de matorral andino bajo umbral y completar con consulta a especialistas los atributos de especies antes de la conformidad del E6.</w:t>
       </w:r>
     </w:p>
     <w:p>
@@ -17240,7 +17991,7 @@
           <w:sz w:val="21"/>
           <w:szCs w:val="21"/>
         </w:rPr>
-        <w:t xml:space="preserve">Anexo 3 — Seguimiento del Diagnóstico del Estado de los Ecosistemas (3-A) y del Estudio de Oferta de Material Vegetal de Propagación (3-B), en coordinación con el Especialista en Intervenciones de Uso Sostenible (actividad d). Comprende la revisión y actualización de los planes de trabajo, la revisión técnica de los entregables, las observaciones y el estado de las conformidades.</w:t>
+        <w:t xml:space="preserve">Anexo 3 — Seguimiento del Diagnóstico del Estado de los Ecosistemas (3-A) y del Estudio de Oferta de Material Vegetal de Propagación (3-B), en coordinación con el Especialista en Intervenciones de Uso Sostenible (actividad d), alineado al Plan de Trabajo institucional v2 y a la metodología de firma espectral. Comprende la revisión y actualización de los planes de trabajo, el seguimiento del cronograma del E6, la revisión técnica de los entregables, las observaciones y el estado de las conformidades.</w:t>
       </w:r>
     </w:p>
     <w:p>

</xml_diff>